<commit_message>
Addition and updates of Templates and Example documents, with associated updates to the Template Manifest.
</commit_message>
<xml_diff>
--- a/public/templates/examples/A-001-CybersecurityCharterLeadershipDesignationLetter-EXAMPLE-L.docx
+++ b/public/templates/examples/A-001-CybersecurityCharterLeadershipDesignationLetter-EXAMPLE-L.docx
@@ -1270,22 +1270,6 @@
         <w:t xml:space="preserve">Profile Scaling Notes</w:t>
       </w:r>
     </w:p>
-    <w:p>
-      <w:pPr>
-        <w:spacing w:after="140"/>
-      </w:pPr>
-      <w:r>
-        <w:rPr>
-          <w:rFonts w:ascii="Aptos" w:cs="Aptos" w:eastAsia="Aptos" w:hAnsi="Aptos"/>
-          <w:i/>
-          <w:iCs/>
-          <w:color w:val="595959"/>
-          <w:sz w:val="24"/>
-          <w:szCs w:val="24"/>
-        </w:rPr>
-        <w:t xml:space="preserve">One short paragraph per profile: what minimum-viable looks like for that reader and where to scale up. Keep all three if this ships as a template; delete the profiles that do not apply once adopted.</w:t>
-      </w:r>
-    </w:p>
     <w:tbl>
       <w:tblPr>
         <w:tblW w:type="dxa" w:w="9360"/>
@@ -1365,134 +1349,6 @@
                 <w:szCs w:val="24"/>
               </w:rPr>
               <w:t xml:space="preserve">Minimum-viable implementation</w:t>
-            </w:r>
-          </w:p>
-        </w:tc>
-      </w:tr>
-      <w:tr>
-        <w:tc>
-          <w:tcPr>
-            <w:tcW w:type="dxa" w:w="3200"/>
-            <w:tcBorders>
-              <w:top w:val="single" w:color="BFBFBF" w:sz="4"/>
-              <w:left w:val="single" w:color="BFBFBF" w:sz="4"/>
-              <w:bottom w:val="single" w:color="BFBFBF" w:sz="4"/>
-              <w:right w:val="single" w:color="BFBFBF" w:sz="4"/>
-            </w:tcBorders>
-            <w:tcMar>
-              <w:top w:type="dxa" w:w="80"/>
-              <w:left w:type="dxa" w:w="120"/>
-              <w:bottom w:type="dxa" w:w="80"/>
-              <w:right w:type="dxa" w:w="120"/>
-            </w:tcMar>
-          </w:tcPr>
-          <w:p>
-            <w:r>
-              <w:rPr>
-                <w:rFonts w:ascii="Aptos" w:cs="Aptos" w:eastAsia="Aptos" w:hAnsi="Aptos"/>
-                <w:b w:val="false"/>
-                <w:bCs w:val="false"/>
-                <w:i w:val="false"/>
-                <w:iCs w:val="false"/>
-                <w:sz w:val="24"/>
-                <w:szCs w:val="24"/>
-              </w:rPr>
-              <w:t xml:space="preserve">Small (1–5 dispatchers, no in-house IT)</w:t>
-            </w:r>
-          </w:p>
-        </w:tc>
-        <w:tc>
-          <w:tcPr>
-            <w:tcW w:type="dxa" w:w="6160"/>
-            <w:tcBorders>
-              <w:top w:val="single" w:color="BFBFBF" w:sz="4"/>
-              <w:left w:val="single" w:color="BFBFBF" w:sz="4"/>
-              <w:bottom w:val="single" w:color="BFBFBF" w:sz="4"/>
-              <w:right w:val="single" w:color="BFBFBF" w:sz="4"/>
-            </w:tcBorders>
-            <w:tcMar>
-              <w:top w:type="dxa" w:w="80"/>
-              <w:left w:type="dxa" w:w="120"/>
-              <w:bottom w:type="dxa" w:w="80"/>
-              <w:right w:type="dxa" w:w="120"/>
-            </w:tcMar>
-          </w:tcPr>
-          <w:p>
-            <w:r>
-              <w:rPr>
-                <w:rFonts w:ascii="Aptos" w:cs="Aptos" w:eastAsia="Aptos" w:hAnsi="Aptos"/>
-                <w:b w:val="false"/>
-                <w:bCs w:val="false"/>
-                <w:i w:val="false"/>
-                <w:iCs w:val="false"/>
-                <w:sz w:val="24"/>
-                <w:szCs w:val="24"/>
-              </w:rPr>
-              <w:t xml:space="preserve">The director is usually both the sponsor and the designated lead, and signs in both roles. County or vendor IT carries out the technical work under the IT Support Accountability Agreement. An annual review is enough; revisit after any incident or staffing change.</w:t>
-            </w:r>
-          </w:p>
-        </w:tc>
-      </w:tr>
-      <w:tr>
-        <w:tc>
-          <w:tcPr>
-            <w:tcW w:type="dxa" w:w="3200"/>
-            <w:tcBorders>
-              <w:top w:val="single" w:color="BFBFBF" w:sz="4"/>
-              <w:left w:val="single" w:color="BFBFBF" w:sz="4"/>
-              <w:bottom w:val="single" w:color="BFBFBF" w:sz="4"/>
-              <w:right w:val="single" w:color="BFBFBF" w:sz="4"/>
-            </w:tcBorders>
-            <w:tcMar>
-              <w:top w:type="dxa" w:w="80"/>
-              <w:left w:type="dxa" w:w="120"/>
-              <w:bottom w:type="dxa" w:w="80"/>
-              <w:right w:type="dxa" w:w="120"/>
-            </w:tcMar>
-          </w:tcPr>
-          <w:p>
-            <w:r>
-              <w:rPr>
-                <w:rFonts w:ascii="Aptos" w:cs="Aptos" w:eastAsia="Aptos" w:hAnsi="Aptos"/>
-                <w:b w:val="false"/>
-                <w:bCs w:val="false"/>
-                <w:i w:val="false"/>
-                <w:iCs w:val="false"/>
-                <w:sz w:val="24"/>
-                <w:szCs w:val="24"/>
-              </w:rPr>
-              <w:t xml:space="preserve">Medium (6–25, shared county IT)</w:t>
-            </w:r>
-          </w:p>
-        </w:tc>
-        <w:tc>
-          <w:tcPr>
-            <w:tcW w:type="dxa" w:w="6160"/>
-            <w:tcBorders>
-              <w:top w:val="single" w:color="BFBFBF" w:sz="4"/>
-              <w:left w:val="single" w:color="BFBFBF" w:sz="4"/>
-              <w:bottom w:val="single" w:color="BFBFBF" w:sz="4"/>
-              <w:right w:val="single" w:color="BFBFBF" w:sz="4"/>
-            </w:tcBorders>
-            <w:tcMar>
-              <w:top w:type="dxa" w:w="80"/>
-              <w:left w:type="dxa" w:w="120"/>
-              <w:bottom w:type="dxa" w:w="80"/>
-              <w:right w:type="dxa" w:w="120"/>
-            </w:tcMar>
-          </w:tcPr>
-          <w:p>
-            <w:r>
-              <w:rPr>
-                <w:rFonts w:ascii="Aptos" w:cs="Aptos" w:eastAsia="Aptos" w:hAnsi="Aptos"/>
-                <w:b w:val="false"/>
-                <w:bCs w:val="false"/>
-                <w:i w:val="false"/>
-                <w:iCs w:val="false"/>
-                <w:sz w:val="24"/>
-                <w:szCs w:val="24"/>
-              </w:rPr>
-              <w:t xml:space="preserve">Name a security coordinator as the designated lead, separate from the director who sponsors the program. Tie the committed budget line to the county's cycle. Review the charter when the coordinator or sponsor changes.</w:t>
             </w:r>
           </w:p>
         </w:tc>
@@ -2523,35 +2379,45 @@
   </w:p>
   <w:p>
     <w:r>
-      <w:rPr>
-        <w:noProof/>
-      </w:rPr>
-      <w:pict>
-        <v:shapetype id="_x0000_t136" coordsize="21600,21600" o:spt="136" adj="10800" path="m@7,0l@8,0m@5,21600l@6,21600e">
-          <v:formulas>
-            <v:f eqn="sum #0 0 10800"/>
-            <v:f eqn="prod #0 2 1"/>
-            <v:f eqn="sum 21600 0 @1"/>
-            <v:f eqn="sum 0 0 @2"/>
-            <v:f eqn="sum 21600 0 @3"/>
-            <v:f eqn="if @0 @3 0"/>
-            <v:f eqn="if @0 21600 @1"/>
-            <v:f eqn="if @0 0 @2"/>
-            <v:f eqn="if @0 @4 21600"/>
-            <v:f eqn="mid @5 @6"/>
-            <v:f eqn="mid @8 @5"/>
-            <v:f eqn="mid @7 @8"/>
-            <v:f eqn="mid @6 @7"/>
-            <v:f eqn="sum @6 0 @5"/>
-          </v:formulas>
-          <v:path textpathok="t" o:connecttype="custom" o:connectlocs="@9,0;@10,10800;@11,21600;@12,10800" o:connectangles="270,180,90,0"/>
-          <v:textpath on="t" fitshape="t"/>
-        </v:shapetype>
-        <v:shape id="WM1" o:spid="_x0000_s2049" type="#_x0000_t136" style="position:absolute;margin-left:0;margin-top:0;width:500pt;height:150pt;rotation:315;z-index:-251658752;mso-position-horizontal:center;mso-position-horizontal-relative:margin;mso-position-vertical:center;mso-position-vertical-relative:margin" fillcolor="#c9c9c9" stroked="f">
-          <v:fill opacity=".5"/>
-          <v:textpath style="font-family:&quot;Calibri&quot;;font-size:1pt" string="SAMPLE"/>
-        </v:shape>
-      </w:pict>
+      <w:drawing>
+        <wp:anchor xmlns:a="http://schemas.openxmlformats.org/drawingml/2006/main" behindDoc="1" distT="0" distB="0" distL="0" distR="0" simplePos="0" locked="0" layoutInCell="1" allowOverlap="1" relativeHeight="0">
+          <wp:simplePos x="0" y="0"/>
+          <wp:positionH relativeFrom="page">
+            <wp:align>center</wp:align>
+          </wp:positionH>
+          <wp:positionV relativeFrom="page">
+            <wp:align>center</wp:align>
+          </wp:positionV>
+          <wp:extent cx="5943600" cy="5943600"/>
+          <wp:effectExtent l="0" t="0" r="0" b="0"/>
+          <wp:wrapNone/>
+          <wp:docPr id="990" name="SampleWatermark"/>
+          <wp:cNvGraphicFramePr/>
+          <a:graphic xmlns:pic="http://schemas.openxmlformats.org/drawingml/2006/picture">
+            <a:graphicData uri="http://schemas.openxmlformats.org/drawingml/2006/picture">
+              <pic:pic>
+                <pic:nvPicPr>
+                  <pic:cNvPr id="0" name="_sample_wm.png"/>
+                  <pic:cNvPicPr/>
+                </pic:nvPicPr>
+                <pic:blipFill>
+                  <a:blip r:embed="rId1"/>
+                  <a:stretch>
+                    <a:fillRect/>
+                  </a:stretch>
+                </pic:blipFill>
+                <pic:spPr>
+                  <a:xfrm>
+                    <a:off x="0" y="0"/>
+                    <a:ext cx="5943600" cy="5943600"/>
+                  </a:xfrm>
+                  <a:prstGeom prst="rect"/>
+                </pic:spPr>
+              </pic:pic>
+            </a:graphicData>
+          </a:graphic>
+        </wp:anchor>
+      </w:drawing>
     </w:r>
   </w:p>
 </w:hdr>

</xml_diff>

<commit_message>
Update artifact templates, examples, and manifest
Sync the latest FORM templates and worked-example documents, including
newly added artifacts, and update the template manifest to match.

Co-Authored-By: Claude Opus 4.8 <noreply@anthropic.com>
</commit_message>
<xml_diff>
--- a/public/templates/examples/A-001-CybersecurityCharterLeadershipDesignationLetter-EXAMPLE-L.docx
+++ b/public/templates/examples/A-001-CybersecurityCharterLeadershipDesignationLetter-EXAMPLE-L.docx
@@ -2,46 +2,6 @@
 <file path=word/document.xml><?xml version="1.0" encoding="utf-8"?>
 <w:document xmlns:wpc="http://schemas.microsoft.com/office/word/2010/wordprocessingCanvas" xmlns:mc="http://schemas.openxmlformats.org/markup-compatibility/2006" xmlns:o="urn:schemas-microsoft-com:office:office" xmlns:r="http://schemas.openxmlformats.org/officeDocument/2006/relationships" xmlns:m="http://schemas.openxmlformats.org/officeDocument/2006/math" xmlns:v="urn:schemas-microsoft-com:vml" xmlns:wp14="http://schemas.microsoft.com/office/word/2010/wordprocessingDrawing" xmlns:wp="http://schemas.openxmlformats.org/drawingml/2006/wordprocessingDrawing" xmlns:w10="urn:schemas-microsoft-com:office:word" xmlns:w="http://schemas.openxmlformats.org/wordprocessingml/2006/main" xmlns:w14="http://schemas.microsoft.com/office/word/2010/wordml" xmlns:w15="http://schemas.microsoft.com/office/word/2012/wordml" xmlns:wpg="http://schemas.microsoft.com/office/word/2010/wordprocessingGroup" xmlns:wpi="http://schemas.microsoft.com/office/word/2010/wordprocessingInk" xmlns:wne="http://schemas.microsoft.com/office/word/2006/wordml" xmlns:wps="http://schemas.microsoft.com/office/word/2010/wordprocessingShape" xmlns:cx="http://schemas.microsoft.com/office/drawing/2014/chartex" xmlns:cx1="http://schemas.microsoft.com/office/drawing/2015/9/8/chartex" xmlns:cx2="http://schemas.microsoft.com/office/drawing/2015/10/21/chartex" xmlns:cx3="http://schemas.microsoft.com/office/drawing/2016/5/9/chartex" xmlns:cx4="http://schemas.microsoft.com/office/drawing/2016/5/10/chartex" xmlns:cx5="http://schemas.microsoft.com/office/drawing/2016/5/11/chartex" xmlns:cx6="http://schemas.microsoft.com/office/drawing/2016/5/12/chartex" xmlns:cx7="http://schemas.microsoft.com/office/drawing/2016/5/13/chartex" xmlns:cx8="http://schemas.microsoft.com/office/drawing/2016/5/14/chartex" xmlns:aink="http://schemas.microsoft.com/office/drawing/2016/ink" xmlns:am3d="http://schemas.microsoft.com/office/drawing/2017/model3d" xmlns:w16cex="http://schemas.microsoft.com/office/word/2018/wordml/cex" xmlns:w16cid="http://schemas.microsoft.com/office/word/2016/wordml/cid" xmlns:w16="http://schemas.microsoft.com/office/word/2018/wordml" xmlns:w16sdtdh="http://schemas.microsoft.com/office/word/2020/wordml/sdtdatahash" xmlns:w16se="http://schemas.microsoft.com/office/word/2015/wordml/symex" mc:Ignorable="w14 w15 wp14">
   <w:body>
-    <w:p>
-      <w:pPr>
-        <w:spacing w:after="80"/>
-        <w:jc w:val="center"/>
-      </w:pPr>
-      <w:r>
-        <w:drawing>
-          <wp:inline xmlns:a="http://schemas.openxmlformats.org/drawingml/2006/main" xmlns:pic="http://schemas.openxmlformats.org/drawingml/2006/picture">
-            <wp:extent cx="960120" cy="960120"/>
-            <wp:docPr id="1" name="Seal"/>
-            <wp:cNvGraphicFramePr>
-              <a:graphicFrameLocks noChangeAspect="1"/>
-            </wp:cNvGraphicFramePr>
-            <a:graphic>
-              <a:graphicData uri="http://schemas.openxmlformats.org/drawingml/2006/picture">
-                <pic:pic>
-                  <pic:nvPicPr>
-                    <pic:cNvPr id="0" name="seal_hickory.png"/>
-                    <pic:cNvPicPr/>
-                  </pic:nvPicPr>
-                  <pic:blipFill>
-                    <a:blip r:embed="rId900"/>
-                    <a:stretch>
-                      <a:fillRect/>
-                    </a:stretch>
-                  </pic:blipFill>
-                  <pic:spPr>
-                    <a:xfrm>
-                      <a:off x="0" y="0"/>
-                      <a:ext cx="960120" cy="960120"/>
-                    </a:xfrm>
-                    <a:prstGeom prst="rect"/>
-                  </pic:spPr>
-                </pic:pic>
-              </a:graphicData>
-            </a:graphic>
-          </wp:inline>
-        </w:drawing>
-      </w:r>
-    </w:p>
     <w:p>
       <w:pPr>
         <w:spacing w:after="60"/>
@@ -2366,7 +2326,7 @@
       <w:pBdr>
         <w:bottom w:val="single" w:color="1B3A5C" w:sz="6" w:space="2"/>
       </w:pBdr>
-      <w:jc w:val="right"/>
+      <w:jc w:val="center"/>
     </w:pPr>
     <w:r>
       <w:rPr>
@@ -2375,6 +2335,40 @@
         <w:sz w:val="16"/>
         <w:szCs w:val="16"/>
       </w:rPr>
+    </w:r>
+    <w:r>
+      <w:drawing>
+        <wp:inline xmlns:a="http://schemas.openxmlformats.org/drawingml/2006/main" xmlns:pic="http://schemas.openxmlformats.org/drawingml/2006/picture">
+          <wp:extent cx="822960" cy="822960"/>
+          <wp:docPr id="1" name="Picture 1"/>
+          <wp:cNvGraphicFramePr>
+            <a:graphicFrameLocks noChangeAspect="1"/>
+          </wp:cNvGraphicFramePr>
+          <a:graphic>
+            <a:graphicData uri="http://schemas.openxmlformats.org/drawingml/2006/picture">
+              <pic:pic>
+                <pic:nvPicPr>
+                  <pic:cNvPr id="0" name="seal_S.png"/>
+                  <pic:cNvPicPr/>
+                </pic:nvPicPr>
+                <pic:blipFill>
+                  <a:blip r:embed="rId1"/>
+                  <a:stretch>
+                    <a:fillRect/>
+                  </a:stretch>
+                </pic:blipFill>
+                <pic:spPr>
+                  <a:xfrm>
+                    <a:off x="0" y="0"/>
+                    <a:ext cx="822960" cy="822960"/>
+                  </a:xfrm>
+                  <a:prstGeom prst="rect"/>
+                </pic:spPr>
+              </pic:pic>
+            </a:graphicData>
+          </a:graphic>
+        </wp:inline>
+      </w:drawing>
     </w:r>
   </w:p>
   <w:p>
@@ -2397,11 +2391,11 @@
             <a:graphicData uri="http://schemas.openxmlformats.org/drawingml/2006/picture">
               <pic:pic>
                 <pic:nvPicPr>
-                  <pic:cNvPr id="0" name="_sample_wm.png"/>
+                  <pic:cNvPr id="0" name="image.png"/>
                   <pic:cNvPicPr/>
                 </pic:nvPicPr>
                 <pic:blipFill>
-                  <a:blip r:embed="rId1"/>
+                  <a:blip r:embed="rId2"/>
                   <a:stretch>
                     <a:fillRect/>
                   </a:stretch>

</xml_diff>